<commit_message>
docs: passport and manual cover equipment temperatures and oil interlock
- new passport section 7.3 (thermal control, oil station, tic201 interlock),
  five temperature alarm-limit rows, updated registry/loop/actuator counts
  (7 assets, 49 tags, 33 IR + 8 HR, 5 loops), interlock acceptance criterion
- manual: loop table row tic201, operator section 6.4 (temperature badges,
  oil station node, interlock behaviour, overload-scenario demo), scenario 9
  in the stand scenario table
- TOC page numbers measured from the fresh render and verified 39/39
</commit_message>
<xml_diff>
--- a/docs/Руководство_оператора_Новое.docx
+++ b/docs/Руководство_оператора_Новое.docx
@@ -560,7 +560,8 @@
         </w:p>
         <w:p>
           <w:pPr>
-            <w:pStyle w:val="9"/>
+            <w:pStyle w:val="11"/>
+            <w:ind w:left="360"/>
             <w:tabs>
               <w:tab w:val="right" w:leader="dot" w:pos="9026"/>
             </w:tabs>
@@ -571,7 +572,7 @@
               <w:rPr>
                 <w:rStyle w:val="Hyperlink"/>
               </w:rPr>
-              <w:t>7. Тренды</w:t>
+              <w:t>6.4. Температура оборудования и маслостанция</w:t>
             </w:r>
             <w:r>
               <w:tab/>
@@ -606,7 +607,7 @@
               <w:rPr>
                 <w:rStyle w:val="Hyperlink"/>
               </w:rPr>
-              <w:t>8. Металлургический баланс</w:t>
+              <w:t>7. Тренды</w:t>
             </w:r>
             <w:r>
               <w:tab/>
@@ -621,7 +622,7 @@
               <w:fldChar w:fldCharType="separate"/>
             </w:r>
             <w:r>
-              <w:t>7</w:t>
+              <w:t>6</w:t>
             </w:r>
             <w:r>
               <w:fldChar w:fldCharType="end"/>
@@ -641,7 +642,7 @@
               <w:rPr>
                 <w:rStyle w:val="Hyperlink"/>
               </w:rPr>
-              <w:t>9. Тревоги и действия оператора</w:t>
+              <w:t>8. Металлургический баланс</w:t>
             </w:r>
             <w:r>
               <w:tab/>
@@ -656,7 +657,7 @@
               <w:fldChar w:fldCharType="separate"/>
             </w:r>
             <w:r>
-              <w:t>8</w:t>
+              <w:t>7</w:t>
             </w:r>
             <w:r>
               <w:fldChar w:fldCharType="end"/>
@@ -665,8 +666,7 @@
         </w:p>
         <w:p>
           <w:pPr>
-            <w:pStyle w:val="11"/>
-            <w:ind w:left="360"/>
+            <w:pStyle w:val="9"/>
             <w:tabs>
               <w:tab w:val="right" w:leader="dot" w:pos="9026"/>
             </w:tabs>
@@ -677,7 +677,7 @@
               <w:rPr>
                 <w:rStyle w:val="Hyperlink"/>
               </w:rPr>
-              <w:t>9.1. Приоритеты и состояния</w:t>
+              <w:t>9. Тревоги и действия оператора</w:t>
             </w:r>
             <w:r>
               <w:tab/>
@@ -692,7 +692,7 @@
               <w:fldChar w:fldCharType="separate"/>
             </w:r>
             <w:r>
-              <w:t>9</w:t>
+              <w:t>8</w:t>
             </w:r>
             <w:r>
               <w:fldChar w:fldCharType="end"/>
@@ -713,7 +713,7 @@
               <w:rPr>
                 <w:rStyle w:val="Hyperlink"/>
               </w:rPr>
-              <w:t>9.2. Квитирование</w:t>
+              <w:t>9.1. Приоритеты и состояния</w:t>
             </w:r>
             <w:r>
               <w:tab/>
@@ -749,7 +749,7 @@
               <w:rPr>
                 <w:rStyle w:val="Hyperlink"/>
               </w:rPr>
-              <w:t>9.3. Типовые ситуации и реагирование</w:t>
+              <w:t>9.2. Квитирование</w:t>
             </w:r>
             <w:r>
               <w:tab/>
@@ -764,7 +764,7 @@
               <w:fldChar w:fldCharType="separate"/>
             </w:r>
             <w:r>
-              <w:t>10</w:t>
+              <w:t>9</w:t>
             </w:r>
             <w:r>
               <w:fldChar w:fldCharType="end"/>
@@ -773,7 +773,8 @@
         </w:p>
         <w:p>
           <w:pPr>
-            <w:pStyle w:val="9"/>
+            <w:pStyle w:val="11"/>
+            <w:ind w:left="360"/>
             <w:tabs>
               <w:tab w:val="right" w:leader="dot" w:pos="9026"/>
             </w:tabs>
@@ -784,7 +785,7 @@
               <w:rPr>
                 <w:rStyle w:val="Hyperlink"/>
               </w:rPr>
-              <w:t>10. Профили руды</w:t>
+              <w:t>9.3. Типовые ситуации и реагирование</w:t>
             </w:r>
             <w:r>
               <w:tab/>
@@ -819,6 +820,41 @@
               <w:rPr>
                 <w:rStyle w:val="Hyperlink"/>
               </w:rPr>
+              <w:t>10. Профили руды</w:t>
+            </w:r>
+            <w:r>
+              <w:tab/>
+            </w:r>
+            <w:r>
+              <w:fldChar w:fldCharType="begin"/>
+            </w:r>
+            <w:r>
+              <w:instrText xml:space="preserve"> PAGEREF _Toc100016 \h </w:instrText>
+            </w:r>
+            <w:r>
+              <w:fldChar w:fldCharType="separate"/>
+            </w:r>
+            <w:r>
+              <w:t>10</w:t>
+            </w:r>
+            <w:r>
+              <w:fldChar w:fldCharType="end"/>
+            </w:r>
+          </w:hyperlink>
+        </w:p>
+        <w:p>
+          <w:pPr>
+            <w:pStyle w:val="9"/>
+            <w:tabs>
+              <w:tab w:val="right" w:leader="dot" w:pos="9026"/>
+            </w:tabs>
+            <w:spacing w:before="120" w:after="60"/>
+          </w:pPr>
+          <w:hyperlink w:anchor="_Toc100017" w:history="1">
+            <w:r>
+              <w:rPr>
+                <w:rStyle w:val="Hyperlink"/>
+              </w:rPr>
               <w:t>11. Администрирование (справочно)</w:t>
             </w:r>
             <w:r>
@@ -828,7 +864,7 @@
               <w:fldChar w:fldCharType="begin"/>
             </w:r>
             <w:r>
-              <w:instrText xml:space="preserve"> PAGEREF _Toc100016 \h </w:instrText>
+              <w:instrText xml:space="preserve"> PAGEREF _Toc100017 \h </w:instrText>
             </w:r>
             <w:r>
               <w:fldChar w:fldCharType="separate"/>
@@ -850,47 +886,12 @@
             </w:tabs>
             <w:spacing w:before="120" w:after="60"/>
           </w:pPr>
-          <w:hyperlink w:anchor="_Toc100017" w:history="1">
+          <w:hyperlink w:anchor="_Toc100018" w:history="1">
             <w:r>
               <w:rPr>
                 <w:rStyle w:val="Hyperlink"/>
               </w:rPr>
               <w:t>11.1. Сценарии демонстрационного стенда</w:t>
-            </w:r>
-            <w:r>
-              <w:tab/>
-            </w:r>
-            <w:r>
-              <w:fldChar w:fldCharType="begin"/>
-            </w:r>
-            <w:r>
-              <w:instrText xml:space="preserve"> PAGEREF _Toc100017 \h </w:instrText>
-            </w:r>
-            <w:r>
-              <w:fldChar w:fldCharType="separate"/>
-            </w:r>
-            <w:r>
-              <w:t>13</w:t>
-            </w:r>
-            <w:r>
-              <w:fldChar w:fldCharType="end"/>
-            </w:r>
-          </w:hyperlink>
-        </w:p>
-        <w:p>
-          <w:pPr>
-            <w:pStyle w:val="9"/>
-            <w:tabs>
-              <w:tab w:val="right" w:leader="dot" w:pos="9026"/>
-            </w:tabs>
-            <w:spacing w:before="120" w:after="60"/>
-          </w:pPr>
-          <w:hyperlink w:anchor="_Toc100018" w:history="1">
-            <w:r>
-              <w:rPr>
-                <w:rStyle w:val="Hyperlink"/>
-              </w:rPr>
-              <w:t>12. Отчёты и выгрузки</w:t>
             </w:r>
             <w:r>
               <w:tab/>
@@ -925,6 +926,41 @@
               <w:rPr>
                 <w:rStyle w:val="Hyperlink"/>
               </w:rPr>
+              <w:t>12. Отчёты и выгрузки</w:t>
+            </w:r>
+            <w:r>
+              <w:tab/>
+            </w:r>
+            <w:r>
+              <w:fldChar w:fldCharType="begin"/>
+            </w:r>
+            <w:r>
+              <w:instrText xml:space="preserve"> PAGEREF _Toc100019 \h </w:instrText>
+            </w:r>
+            <w:r>
+              <w:fldChar w:fldCharType="separate"/>
+            </w:r>
+            <w:r>
+              <w:t>14</w:t>
+            </w:r>
+            <w:r>
+              <w:fldChar w:fldCharType="end"/>
+            </w:r>
+          </w:hyperlink>
+        </w:p>
+        <w:p>
+          <w:pPr>
+            <w:pStyle w:val="9"/>
+            <w:tabs>
+              <w:tab w:val="right" w:leader="dot" w:pos="9026"/>
+            </w:tabs>
+            <w:spacing w:before="120" w:after="60"/>
+          </w:pPr>
+          <w:hyperlink w:anchor="_Toc100020" w:history="1">
+            <w:r>
+              <w:rPr>
+                <w:rStyle w:val="Hyperlink"/>
+              </w:rPr>
               <w:t>13. Практические замечания</w:t>
             </w:r>
             <w:r>
@@ -934,7 +970,7 @@
               <w:fldChar w:fldCharType="begin"/>
             </w:r>
             <w:r>
-              <w:instrText xml:space="preserve"> PAGEREF _Toc100019 \h </w:instrText>
+              <w:instrText xml:space="preserve"> PAGEREF _Toc100020 \h </w:instrText>
             </w:r>
             <w:r>
               <w:fldChar w:fldCharType="separate"/>
@@ -2522,6 +2558,179 @@
           </w:p>
         </w:tc>
       </w:tr>
+      <w:tr>
+        <w:trPr>
+          <w:cantSplit/>
+        </w:trPr>
+        <w:tc>
+          <w:tcPr>
+            <w:tcW w:type="pct" w:w="10%"/>
+            <w:tcMar>
+              <w:top w:type="dxa" w:w="60"/>
+              <w:left w:type="dxa" w:w="120"/>
+              <w:bottom w:type="dxa" w:w="60"/>
+              <w:right w:type="dxa" w:w="120"/>
+            </w:tcMar>
+            <w:vAlign w:val="center"/>
+          </w:tcPr>
+          <w:p>
+            <w:pPr>
+              <w:spacing w:line="276"/>
+            </w:pPr>
+            <w:r>
+              <w:rPr>
+                <w:rFonts w:ascii="Times New Roman" w:hAnsi="Times New Roman"/>
+                <w:b w:val="false"/>
+                <w:bCs w:val="false"/>
+                <w:color w:val="1A2332"/>
+                <w:sz w:val="20"/>
+                <w:szCs w:val="20"/>
+              </w:rPr>
+              <w:t xml:space="preserve">tic201</w:t>
+            </w:r>
+          </w:p>
+        </w:tc>
+        <w:tc>
+          <w:tcPr>
+            <w:tcW w:type="pct" w:w="24%"/>
+            <w:tcMar>
+              <w:top w:type="dxa" w:w="60"/>
+              <w:left w:type="dxa" w:w="120"/>
+              <w:bottom w:type="dxa" w:w="60"/>
+              <w:right w:type="dxa" w:w="120"/>
+            </w:tcMar>
+            <w:vAlign w:val="center"/>
+          </w:tcPr>
+          <w:p>
+            <w:pPr>
+              <w:spacing w:line="276"/>
+            </w:pPr>
+            <w:r>
+              <w:rPr>
+                <w:rFonts w:ascii="Times New Roman" w:hAnsi="Times New Roman"/>
+                <w:b w:val="false"/>
+                <w:bCs w:val="false"/>
+                <w:color w:val="1A2332"/>
+                <w:sz w:val="20"/>
+                <w:szCs w:val="20"/>
+              </w:rPr>
+              <w:t xml:space="preserve">Температура подшипника мельницы</w:t>
+            </w:r>
+          </w:p>
+        </w:tc>
+        <w:tc>
+          <w:tcPr>
+            <w:tcW w:type="pct" w:w="16%"/>
+            <w:tcMar>
+              <w:top w:type="dxa" w:w="60"/>
+              <w:left w:type="dxa" w:w="120"/>
+              <w:bottom w:type="dxa" w:w="60"/>
+              <w:right w:type="dxa" w:w="120"/>
+            </w:tcMar>
+            <w:vAlign w:val="center"/>
+          </w:tcPr>
+          <w:p>
+            <w:pPr>
+              <w:spacing w:line="276"/>
+            </w:pPr>
+            <w:r>
+              <w:rPr>
+                <w:rFonts w:ascii="Times New Roman" w:hAnsi="Times New Roman"/>
+                <w:b w:val="false"/>
+                <w:bCs w:val="false"/>
+                <w:color w:val="1A2332"/>
+                <w:sz w:val="20"/>
+                <w:szCs w:val="20"/>
+              </w:rPr>
+              <w:t xml:space="preserve">ti201, °C</w:t>
+            </w:r>
+          </w:p>
+        </w:tc>
+        <w:tc>
+          <w:tcPr>
+            <w:tcW w:type="pct" w:w="24%"/>
+            <w:tcMar>
+              <w:top w:type="dxa" w:w="60"/>
+              <w:left w:type="dxa" w:w="120"/>
+              <w:bottom w:type="dxa" w:w="60"/>
+              <w:right w:type="dxa" w:w="120"/>
+            </w:tcMar>
+            <w:vAlign w:val="center"/>
+          </w:tcPr>
+          <w:p>
+            <w:pPr>
+              <w:spacing w:line="276"/>
+            </w:pPr>
+            <w:r>
+              <w:rPr>
+                <w:rFonts w:ascii="Times New Roman" w:hAnsi="Times New Roman"/>
+                <w:b w:val="false"/>
+                <w:bCs w:val="false"/>
+                <w:color w:val="1A2332"/>
+                <w:sz w:val="20"/>
+                <w:szCs w:val="20"/>
+              </w:rPr>
+              <w:t xml:space="preserve">ho101 (клапан маслостанции), %</w:t>
+            </w:r>
+          </w:p>
+        </w:tc>
+        <w:tc>
+          <w:tcPr>
+            <w:tcW w:type="pct" w:w="14%"/>
+            <w:tcMar>
+              <w:top w:type="dxa" w:w="60"/>
+              <w:left w:type="dxa" w:w="120"/>
+              <w:bottom w:type="dxa" w:w="60"/>
+              <w:right w:type="dxa" w:w="120"/>
+            </w:tcMar>
+            <w:vAlign w:val="center"/>
+          </w:tcPr>
+          <w:p>
+            <w:pPr>
+              <w:spacing w:line="276"/>
+            </w:pPr>
+            <w:r>
+              <w:rPr>
+                <w:rFonts w:ascii="Times New Roman" w:hAnsi="Times New Roman"/>
+                <w:b w:val="false"/>
+                <w:bCs w:val="false"/>
+                <w:color w:val="1A2332"/>
+                <w:sz w:val="20"/>
+                <w:szCs w:val="20"/>
+              </w:rPr>
+              <w:t xml:space="preserve">55 °C</w:t>
+            </w:r>
+          </w:p>
+        </w:tc>
+        <w:tc>
+          <w:tcPr>
+            <w:tcW w:type="pct" w:w="12%"/>
+            <w:tcMar>
+              <w:top w:type="dxa" w:w="60"/>
+              <w:left w:type="dxa" w:w="120"/>
+              <w:bottom w:type="dxa" w:w="60"/>
+              <w:right w:type="dxa" w:w="120"/>
+            </w:tcMar>
+            <w:vAlign w:val="center"/>
+          </w:tcPr>
+          <w:p>
+            <w:pPr>
+              <w:spacing w:line="276"/>
+            </w:pPr>
+            <w:r>
+              <w:rPr>
+                <w:rFonts w:ascii="Times New Roman" w:hAnsi="Times New Roman"/>
+                <w:b w:val="false"/>
+                <w:bCs w:val="false"/>
+                <w:color w:val="1A2332"/>
+                <w:sz w:val="20"/>
+                <w:szCs w:val="20"/>
+              </w:rPr>
+              <w:t xml:space="preserve">40–70</w:t>
+            </w:r>
+          </w:p>
+        </w:tc>
+      </w:tr>
     </w:tbl>
     <w:p>
       <w:pPr>
@@ -2882,10 +3091,61 @@
     </w:p>
     <w:p>
       <w:pPr>
+        <w:pStyle w:val="Heading2"/>
+        <w:spacing w:after="120" w:before="280" w:line="312"/>
+      </w:pPr>
+      <w:bookmarkStart w:id="100009" w:name="_Toc100009"/>
+      <w:r>
+        <w:rPr>
+          <w:rFonts w:ascii="Times New Roman" w:hAnsi="Times New Roman"/>
+          <w:b/>
+          <w:bCs/>
+          <w:color w:val="0F172A"/>
+          <w:sz w:val="28"/>
+          <w:szCs w:val="28"/>
+        </w:rPr>
+        <w:t xml:space="preserve">6.4. Температура оборудования и маслостанция</w:t>
+      </w:r>
+      <w:bookmarkEnd w:id="100009"/>
+    </w:p>
+    <w:p>
+      <w:pPr>
+        <w:spacing w:after="100" w:line="312"/>
+        <w:ind w:firstLine="709"/>
+        <w:jc w:val="both"/>
+      </w:pPr>
+      <w:r>
+        <w:rPr>
+          <w:rFonts w:ascii="Times New Roman" w:hAnsi="Times New Roman"/>
+          <w:color w:val="1A2332"/>
+          <w:sz w:val="24"/>
+          <w:szCs w:val="24"/>
+        </w:rPr>
+        <w:t xml:space="preserve">На мнемосхеме каждый узел несёт температурный бейдж (подшипники дробилки и мельницы, пульпа флотации, привод гребков, вакуум-насос); при превышении верхнего предела бейдж краснеет. Рядом расположен узел «Маслостанция» с положением клапана ho101: 100 % — аварийный залив.</w:t>
+      </w:r>
+    </w:p>
+    <w:p>
+      <w:pPr>
+        <w:spacing w:after="100" w:line="312"/>
+        <w:ind w:firstLine="709"/>
+        <w:jc w:val="both"/>
+      </w:pPr>
+      <w:r>
+        <w:rPr>
+          <w:rFonts w:ascii="Times New Roman" w:hAnsi="Times New Roman"/>
+          <w:color w:val="1A2332"/>
+          <w:sz w:val="24"/>
+          <w:szCs w:val="24"/>
+        </w:rPr>
+        <w:t xml:space="preserve">Контур tic201 (температура подшипника мельницы → клапан масла) работает как обычный ПИД с уставкой 55 °C, но имеет температурный интерлок: при 75 °C и выше клапан принудительно открывается на 100 % даже из ручного режима (состояние панели — «ПЕРЕГРЕВ → масло 100 %», критическая тревога). Сброс — после остывания ниже 70 °C: контур возвращается оператору в ручной режим, клапан остаётся в текущем положении. Для демонстрации используйте сценарий «Пиковая нагрузка мельницы» (раздел 11.1): перегрев развивается за 1–2 минуты и гарантированно проходит порог интерлока.</w:t>
+      </w:r>
+    </w:p>
+    <w:p>
+      <w:pPr>
         <w:pStyle w:val="Heading1"/>
         <w:spacing w:after="160" w:before="400" w:line="312"/>
       </w:pPr>
-      <w:bookmarkStart w:id="100009" w:name="_Toc100009"/>
+      <w:bookmarkStart w:id="100010" w:name="_Toc100010"/>
       <w:r>
         <w:rPr>
           <w:rFonts w:ascii="Times New Roman" w:hAnsi="Times New Roman"/>
@@ -2897,7 +3157,7 @@
         </w:rPr>
         <w:t xml:space="preserve">7. Тренды</w:t>
       </w:r>
-      <w:bookmarkEnd w:id="100009"/>
+      <w:bookmarkEnd w:id="100010"/>
     </w:p>
     <w:p>
       <w:pPr>
@@ -3066,7 +3326,7 @@
         <w:pStyle w:val="Heading1"/>
         <w:spacing w:after="160" w:before="400" w:line="312"/>
       </w:pPr>
-      <w:bookmarkStart w:id="100010" w:name="_Toc100010"/>
+      <w:bookmarkStart w:id="100011" w:name="_Toc100011"/>
       <w:r>
         <w:rPr>
           <w:rFonts w:ascii="Times New Roman" w:hAnsi="Times New Roman"/>
@@ -3078,7 +3338,7 @@
         </w:rPr>
         <w:t xml:space="preserve">8. Металлургический баланс</w:t>
       </w:r>
-      <w:bookmarkEnd w:id="100010"/>
+      <w:bookmarkEnd w:id="100011"/>
     </w:p>
     <w:p>
       <w:pPr>
@@ -3243,7 +3503,7 @@
         <w:pStyle w:val="Heading1"/>
         <w:spacing w:after="160" w:before="400" w:line="312"/>
       </w:pPr>
-      <w:bookmarkStart w:id="100011" w:name="_Toc100011"/>
+      <w:bookmarkStart w:id="100012" w:name="_Toc100012"/>
       <w:r>
         <w:rPr>
           <w:rFonts w:ascii="Times New Roman" w:hAnsi="Times New Roman"/>
@@ -3255,7 +3515,7 @@
         </w:rPr>
         <w:t xml:space="preserve">9. Тревоги и действия оператора</w:t>
       </w:r>
-      <w:bookmarkEnd w:id="100011"/>
+      <w:bookmarkEnd w:id="100012"/>
     </w:p>
     <w:p>
       <w:pPr>
@@ -3324,7 +3584,7 @@
         <w:pStyle w:val="Heading2"/>
         <w:spacing w:after="120" w:before="280" w:line="312"/>
       </w:pPr>
-      <w:bookmarkStart w:id="100012" w:name="_Toc100012"/>
+      <w:bookmarkStart w:id="100013" w:name="_Toc100013"/>
       <w:r>
         <w:rPr>
           <w:rFonts w:ascii="Times New Roman" w:hAnsi="Times New Roman"/>
@@ -3336,7 +3596,7 @@
         </w:rPr>
         <w:t xml:space="preserve">9.1. Приоритеты и состояния</w:t>
       </w:r>
-      <w:bookmarkEnd w:id="100012"/>
+      <w:bookmarkEnd w:id="100013"/>
     </w:p>
     <w:p>
       <w:pPr>
@@ -3985,7 +4245,7 @@
         <w:pStyle w:val="Heading2"/>
         <w:spacing w:after="120" w:before="280" w:line="312"/>
       </w:pPr>
-      <w:bookmarkStart w:id="100013" w:name="_Toc100013"/>
+      <w:bookmarkStart w:id="100014" w:name="_Toc100014"/>
       <w:r>
         <w:rPr>
           <w:rFonts w:ascii="Times New Roman" w:hAnsi="Times New Roman"/>
@@ -3997,7 +4257,7 @@
         </w:rPr>
         <w:t xml:space="preserve">9.2. Квитирование</w:t>
       </w:r>
-      <w:bookmarkEnd w:id="100013"/>
+      <w:bookmarkEnd w:id="100014"/>
     </w:p>
     <w:p>
       <w:pPr>
@@ -4080,7 +4340,7 @@
         <w:pStyle w:val="Heading2"/>
         <w:spacing w:after="120" w:before="280" w:line="312"/>
       </w:pPr>
-      <w:bookmarkStart w:id="100014" w:name="_Toc100014"/>
+      <w:bookmarkStart w:id="100015" w:name="_Toc100015"/>
       <w:r>
         <w:rPr>
           <w:rFonts w:ascii="Times New Roman" w:hAnsi="Times New Roman"/>
@@ -4092,7 +4352,7 @@
         </w:rPr>
         <w:t xml:space="preserve">9.3. Типовые ситуации и реагирование</w:t>
       </w:r>
-      <w:bookmarkEnd w:id="100014"/>
+      <w:bookmarkEnd w:id="100015"/>
     </w:p>
     <w:p>
       <w:pPr>
@@ -4761,7 +5021,7 @@
         <w:pStyle w:val="Heading1"/>
         <w:spacing w:after="160" w:before="400" w:line="312"/>
       </w:pPr>
-      <w:bookmarkStart w:id="100015" w:name="_Toc100015"/>
+      <w:bookmarkStart w:id="100016" w:name="_Toc100016"/>
       <w:r>
         <w:rPr>
           <w:rFonts w:ascii="Times New Roman" w:hAnsi="Times New Roman"/>
@@ -4773,7 +5033,7 @@
         </w:rPr>
         <w:t xml:space="preserve">10. Профили руды</w:t>
       </w:r>
-      <w:bookmarkEnd w:id="100015"/>
+      <w:bookmarkEnd w:id="100016"/>
     </w:p>
     <w:p>
       <w:pPr>
@@ -4902,7 +5162,7 @@
         <w:pStyle w:val="Heading1"/>
         <w:spacing w:after="160" w:before="400" w:line="312"/>
       </w:pPr>
-      <w:bookmarkStart w:id="100016" w:name="_Toc100016"/>
+      <w:bookmarkStart w:id="100017" w:name="_Toc100017"/>
       <w:r>
         <w:rPr>
           <w:rFonts w:ascii="Times New Roman" w:hAnsi="Times New Roman"/>
@@ -4914,7 +5174,7 @@
         </w:rPr>
         <w:t xml:space="preserve">11. Администрирование (справочно)</w:t>
       </w:r>
-      <w:bookmarkEnd w:id="100016"/>
+      <w:bookmarkEnd w:id="100017"/>
     </w:p>
     <w:p>
       <w:pPr>
@@ -5109,7 +5369,7 @@
         <w:pStyle w:val="Heading2"/>
         <w:spacing w:after="120" w:before="280" w:line="312"/>
       </w:pPr>
-      <w:bookmarkStart w:id="100017" w:name="_Toc100017"/>
+      <w:bookmarkStart w:id="100018" w:name="_Toc100018"/>
       <w:r>
         <w:rPr>
           <w:rFonts w:ascii="Times New Roman" w:hAnsi="Times New Roman"/>
@@ -5121,7 +5381,7 @@
         </w:rPr>
         <w:t xml:space="preserve">11.1. Сценарии демонстрационного стенда</w:t>
       </w:r>
-      <w:bookmarkEnd w:id="100017"/>
+      <w:bookmarkEnd w:id="100018"/>
     </w:p>
     <w:p>
       <w:pPr>
@@ -6051,13 +6311,102 @@
           </w:p>
         </w:tc>
       </w:tr>
+      <w:tr>
+        <w:trPr>
+          <w:cantSplit/>
+        </w:trPr>
+        <w:tc>
+          <w:tcPr>
+            <w:tcW w:type="pct" w:w="26%"/>
+            <w:tcMar>
+              <w:top w:type="dxa" w:w="60"/>
+              <w:left w:type="dxa" w:w="120"/>
+              <w:bottom w:type="dxa" w:w="60"/>
+              <w:right w:type="dxa" w:w="120"/>
+            </w:tcMar>
+            <w:vAlign w:val="center"/>
+          </w:tcPr>
+          <w:p>
+            <w:pPr>
+              <w:spacing w:line="276"/>
+            </w:pPr>
+            <w:r>
+              <w:rPr>
+                <w:rFonts w:ascii="Times New Roman" w:hAnsi="Times New Roman"/>
+                <w:b w:val="false"/>
+                <w:bCs w:val="false"/>
+                <w:color w:val="1A2332"/>
+                <w:sz w:val="20"/>
+                <w:szCs w:val="20"/>
+              </w:rPr>
+              <w:t xml:space="preserve">Пиковая нагрузка мельницы</w:t>
+            </w:r>
+          </w:p>
+        </w:tc>
+        <w:tc>
+          <w:tcPr>
+            <w:tcW w:type="pct" w:w="46%"/>
+            <w:tcMar>
+              <w:top w:type="dxa" w:w="60"/>
+              <w:left w:type="dxa" w:w="120"/>
+              <w:bottom w:type="dxa" w:w="60"/>
+              <w:right w:type="dxa" w:w="120"/>
+            </w:tcMar>
+            <w:vAlign w:val="center"/>
+          </w:tcPr>
+          <w:p>
+            <w:pPr>
+              <w:spacing w:line="276"/>
+            </w:pPr>
+            <w:r>
+              <w:rPr>
+                <w:rFonts w:ascii="Times New Roman" w:hAnsi="Times New Roman"/>
+                <w:b w:val="false"/>
+                <w:bCs w:val="false"/>
+                <w:color w:val="1A2332"/>
+                <w:sz w:val="20"/>
+                <w:szCs w:val="20"/>
+              </w:rPr>
+              <w:t xml:space="preserve">нагрев подшипника → проверка масляного интерлока tic201</w:t>
+            </w:r>
+          </w:p>
+        </w:tc>
+        <w:tc>
+          <w:tcPr>
+            <w:tcW w:type="pct" w:w="28%"/>
+            <w:tcMar>
+              <w:top w:type="dxa" w:w="60"/>
+              <w:left w:type="dxa" w:w="120"/>
+              <w:bottom w:type="dxa" w:w="60"/>
+              <w:right w:type="dxa" w:w="120"/>
+            </w:tcMar>
+            <w:vAlign w:val="center"/>
+          </w:tcPr>
+          <w:p>
+            <w:pPr>
+              <w:spacing w:line="276"/>
+            </w:pPr>
+            <w:r>
+              <w:rPr>
+                <w:rFonts w:ascii="Times New Roman" w:hAnsi="Times New Roman"/>
+                <w:b w:val="false"/>
+                <w:bCs w:val="false"/>
+                <w:color w:val="1A2332"/>
+                <w:sz w:val="20"/>
+                <w:szCs w:val="20"/>
+              </w:rPr>
+              <w:t xml:space="preserve">длительность, с</w:t>
+            </w:r>
+          </w:p>
+        </w:tc>
+      </w:tr>
     </w:tbl>
     <w:p>
       <w:pPr>
         <w:pStyle w:val="Heading1"/>
         <w:spacing w:after="160" w:before="400" w:line="312"/>
       </w:pPr>
-      <w:bookmarkStart w:id="100018" w:name="_Toc100018"/>
+      <w:bookmarkStart w:id="100019" w:name="_Toc100019"/>
       <w:r>
         <w:rPr>
           <w:rFonts w:ascii="Times New Roman" w:hAnsi="Times New Roman"/>
@@ -6069,7 +6418,7 @@
         </w:rPr>
         <w:t xml:space="preserve">12. Отчёты и выгрузки</w:t>
       </w:r>
-      <w:bookmarkEnd w:id="100018"/>
+      <w:bookmarkEnd w:id="100019"/>
     </w:p>
     <w:p>
       <w:pPr>
@@ -6092,7 +6441,7 @@
         <w:pStyle w:val="Heading1"/>
         <w:spacing w:after="160" w:before="400" w:line="312"/>
       </w:pPr>
-      <w:bookmarkStart w:id="100019" w:name="_Toc100019"/>
+      <w:bookmarkStart w:id="100020" w:name="_Toc100020"/>
       <w:r>
         <w:rPr>
           <w:rFonts w:ascii="Times New Roman" w:hAnsi="Times New Roman"/>
@@ -6104,7 +6453,7 @@
         </w:rPr>
         <w:t xml:space="preserve">13. Практические замечания</w:t>
       </w:r>
-      <w:bookmarkEnd w:id="100019"/>
+      <w:bookmarkEnd w:id="100020"/>
     </w:p>
     <w:p>
       <w:pPr>

</xml_diff>